<commit_message>
Add project Word documents
</commit_message>
<xml_diff>
--- a/Project/FitRise_B5_G13.docx
+++ b/Project/FitRise_B5_G13.docx
@@ -243,9 +243,6 @@
         <w:spacing w:line="360" w:lineRule="auto"/>
         <w:ind w:right="357"/>
         <w:jc w:val="center"/>
-        <w:rPr>
-          <w:rFonts w:hint="cs"/>
-        </w:rPr>
       </w:pPr>
       <w:hyperlink r:id="rId10" w:history="1">
         <w:r>
@@ -8872,7 +8869,7 @@
         <w:spacing w:line="480" w:lineRule="auto"/>
         <w:ind w:right="357"/>
         <w:rPr>
-          <w:u w:val="single"/>
+          <w:rStyle w:val="Hyperlink"/>
           <w:rtl/>
         </w:rPr>
       </w:pPr>
@@ -8898,9 +8895,40 @@
         <w:bidi/>
         <w:spacing w:line="480" w:lineRule="auto"/>
         <w:ind w:right="357"/>
-        <w:rPr>
+        <w:jc w:val="right"/>
+        <w:rPr>
+          <w:rStyle w:val="Hyperlink"/>
+          <w:lang w:val="en-US"/>
+        </w:rPr>
+      </w:pPr>
+    </w:p>
+    <w:p>
+      <w:pPr>
+        <w:bidi/>
+        <w:spacing w:line="480" w:lineRule="auto"/>
+        <w:ind w:right="357"/>
+        <w:jc w:val="right"/>
+        <w:rPr>
+          <w:color w:val="0000FF" w:themeColor="hyperlink"/>
           <w:u w:val="single"/>
           <w:rtl/>
+        </w:rPr>
+      </w:pPr>
+      <w:r>
+        <w:rPr>
+          <w:rStyle w:val="Hyperlink"/>
+        </w:rPr>
+        <w:t>https://github.com/safazid/WEB-project/blob/main/Project/%D7%AA%D7%99%D7%A7%20%D7%9C%D7%9E%D7%AA%D7%9B%D7%A0%D7%AA%20web%20B5.docx</w:t>
+      </w:r>
+    </w:p>
+    <w:p>
+      <w:pPr>
+        <w:bidi/>
+        <w:spacing w:line="480" w:lineRule="auto"/>
+        <w:ind w:right="357"/>
+        <w:rPr>
+          <w:u w:val="single"/>
+          <w:rtl/>
           <w:lang w:val="en-US" w:bidi="he-IL"/>
         </w:rPr>
       </w:pPr>
@@ -8911,6 +8939,7 @@
           <w:rtl/>
           <w:lang w:val="en-US" w:bidi="he-IL"/>
         </w:rPr>
+        <w:lastRenderedPageBreak/>
         <w:t>יש להגיש תיק משתמש:</w:t>
       </w:r>
     </w:p>
@@ -9188,9 +9217,9 @@
         <w:bidi/>
         <w:ind w:left="720"/>
         <w:rPr>
+          <w:rStyle w:val="Hyperlink"/>
           <w:sz w:val="24"/>
           <w:szCs w:val="24"/>
-          <w:rtl/>
           <w:lang w:bidi="he"/>
         </w:rPr>
       </w:pPr>
@@ -9215,6 +9244,77 @@
           <w:t>web B5.docx</w:t>
         </w:r>
       </w:hyperlink>
+      <w:r>
+        <w:rPr>
+          <w:rStyle w:val="Hyperlink"/>
+          <w:rFonts w:hint="cs"/>
+          <w:sz w:val="24"/>
+          <w:szCs w:val="24"/>
+          <w:rtl/>
+          <w:lang w:bidi="he"/>
+        </w:rPr>
+        <w:t xml:space="preserve"> </w:t>
+      </w:r>
+    </w:p>
+    <w:p>
+      <w:pPr>
+        <w:bidi/>
+        <w:ind w:left="720"/>
+        <w:rPr>
+          <w:rStyle w:val="Hyperlink"/>
+          <w:sz w:val="24"/>
+          <w:szCs w:val="24"/>
+          <w:lang w:bidi="he"/>
+        </w:rPr>
+      </w:pPr>
+    </w:p>
+    <w:p>
+      <w:pPr>
+        <w:bidi/>
+        <w:rPr>
+          <w:rStyle w:val="Hyperlink"/>
+          <w:rFonts w:hint="cs"/>
+          <w:sz w:val="24"/>
+          <w:szCs w:val="24"/>
+          <w:rtl/>
+          <w:lang w:bidi="he-IL"/>
+        </w:rPr>
+      </w:pPr>
+    </w:p>
+    <w:p>
+      <w:pPr>
+        <w:bidi/>
+        <w:ind w:left="720"/>
+        <w:jc w:val="right"/>
+        <w:rPr>
+          <w:sz w:val="24"/>
+          <w:szCs w:val="24"/>
+          <w:lang w:bidi="he"/>
+        </w:rPr>
+      </w:pPr>
+      <w:hyperlink r:id="rId22" w:history="1">
+        <w:r>
+          <w:rPr>
+            <w:rStyle w:val="Hyperlink"/>
+            <w:sz w:val="24"/>
+            <w:szCs w:val="24"/>
+            <w:lang w:bidi="he"/>
+          </w:rPr>
+          <w:t>https://github.com/safazid/WEB-project/blob/main/Project/%D7%AA%D7%99%D7%A7%20%D7%9C%D7%9E%D7%A9%D7%AA%D7%9E%D7%A9%20web%20B5.docx</w:t>
+        </w:r>
+      </w:hyperlink>
+    </w:p>
+    <w:p>
+      <w:pPr>
+        <w:bidi/>
+        <w:ind w:left="720"/>
+        <w:rPr>
+          <w:sz w:val="24"/>
+          <w:szCs w:val="24"/>
+          <w:rtl/>
+          <w:lang w:bidi="he"/>
+        </w:rPr>
+      </w:pPr>
     </w:p>
     <w:p>
       <w:pPr>
@@ -9227,6 +9327,8 @@
           <w:lang w:val="en-US" w:bidi="he-IL"/>
         </w:rPr>
       </w:pPr>
+      <w:bookmarkStart w:id="0" w:name="_GoBack"/>
+      <w:bookmarkEnd w:id="0"/>
     </w:p>
     <w:p>
       <w:pPr>
@@ -9321,7 +9423,7 @@
         <w:spacing w:line="480" w:lineRule="auto"/>
         <w:ind w:right="357"/>
       </w:pPr>
-      <w:hyperlink r:id="rId22" w:history="1">
+      <w:hyperlink r:id="rId23" w:history="1">
         <w:r>
           <w:rPr>
             <w:rStyle w:val="Hyperlink"/>
@@ -9404,8 +9506,6 @@
           <w:lang w:val="en-US" w:bidi="he-IL"/>
         </w:rPr>
       </w:pPr>
-      <w:bookmarkStart w:id="0" w:name="_GoBack"/>
-      <w:bookmarkEnd w:id="0"/>
     </w:p>
     <w:p>
       <w:pPr>
@@ -9419,7 +9519,7 @@
           <w:lang w:bidi="he-IL"/>
         </w:rPr>
       </w:pPr>
-      <w:hyperlink r:id="rId23" w:history="1">
+      <w:hyperlink r:id="rId24" w:history="1">
         <w:r>
           <w:rPr>
             <w:rStyle w:val="Hyperlink"/>
@@ -9447,11 +9547,8 @@
         <w:spacing w:line="360" w:lineRule="auto"/>
         <w:ind w:right="357"/>
         <w:jc w:val="center"/>
-        <w:rPr>
-          <w:rFonts w:hint="cs"/>
-        </w:rPr>
-      </w:pPr>
-      <w:hyperlink r:id="rId24" w:history="1">
+      </w:pPr>
+      <w:hyperlink r:id="rId25" w:history="1">
         <w:r>
           <w:rPr>
             <w:rStyle w:val="Hyperlink"/>
@@ -9465,14 +9562,13 @@
       <w:pPr>
         <w:jc w:val="right"/>
         <w:rPr>
-          <w:rFonts w:hint="cs"/>
           <w:rtl/>
           <w:lang w:bidi="he-IL"/>
         </w:rPr>
       </w:pPr>
     </w:p>
     <w:sectPr>
-      <w:headerReference w:type="default" r:id="rId25"/>
+      <w:headerReference w:type="default" r:id="rId26"/>
       <w:pgSz w:w="12240" w:h="15840"/>
       <w:pgMar w:top="1440" w:right="1440" w:bottom="1440" w:left="1440" w:header="720" w:footer="720" w:gutter="0"/>
       <w:pgNumType w:start="1"/>
@@ -12421,7 +12517,7 @@
 </file>
 
 <file path=customXml/itemProps2.xml><?xml version="1.0" encoding="utf-8"?>
-<ds:datastoreItem xmlns:ds="http://schemas.openxmlformats.org/officeDocument/2006/customXml" ds:itemID="{710FFE59-FB93-4BBE-849D-737448348D42}">
+<ds:datastoreItem xmlns:ds="http://schemas.openxmlformats.org/officeDocument/2006/customXml" ds:itemID="{92632967-1FA4-4E2F-9622-32724291DF49}">
   <ds:schemaRefs>
     <ds:schemaRef ds:uri="http://schemas.openxmlformats.org/officeDocument/2006/bibliography"/>
   </ds:schemaRefs>

</xml_diff>